<commit_message>
Title page clean rebuild: exact spacer order, 14pt bold title, 12pt body, 1.15 spacing, Name/Date on p1
</commit_message>
<xml_diff>
--- a/thesis/Velasquez_CTA_Skincare_Thesis_DRAFT_004.docx
+++ b/thesis/Velasquez_CTA_Skincare_Thesis_DRAFT_004.docx
@@ -4,247 +4,449 @@
   <w:body>
     <w:p>
       <w:pPr>
-        <w:spacing w:before="0" w:after="0" w:line="480" w:lineRule="auto"/>
+        <w:spacing w:before="0" w:after="0" w:line="276" w:lineRule="auto"/>
+        <w:jc w:val="center"/>
         <w:ind w:firstLine="0"/>
+      </w:pPr>
+      <w:r>
+        <w:rPr>
+          <w:rFonts w:ascii="Georgia" w:hAnsi="Georgia" w:cs="Georgia"/>
+          <w:sz w:val="24"/>
+          <w:szCs w:val="24"/>
+        </w:rPr>
+      </w:r>
+    </w:p>
+    <w:p>
+      <w:pPr>
+        <w:spacing w:before="0" w:after="0" w:line="276" w:lineRule="auto"/>
         <w:jc w:val="center"/>
-      </w:pPr>
-      <w:r>
-        <w:rPr>
-          <w:rFonts w:ascii="Georgia" w:hAnsi="Georgia"/>
+        <w:ind w:firstLine="0"/>
+      </w:pPr>
+      <w:r>
+        <w:rPr>
+          <w:rFonts w:ascii="Georgia" w:hAnsi="Georgia" w:cs="Georgia"/>
           <w:sz w:val="24"/>
-        </w:rPr>
-      </w:r>
-    </w:p>
-    <w:p>
-      <w:pPr>
-        <w:spacing w:before="0" w:after="0" w:line="480" w:lineRule="auto"/>
-        <w:ind w:firstLine="720"/>
-        <w:jc w:val="both"/>
-      </w:pPr>
-      <w:r>
-        <w:rPr>
-          <w:rFonts w:ascii="Georgia" w:hAnsi="Georgia"/>
-          <w:b w:val="0"/>
-          <w:sz w:val="22"/>
-        </w:rPr>
-        <w:t xml:space="preserve">PERSUASIVE LANGUAGE IN CALL-TO-ACTION PHRASES OF FACEBOOK SKINCARE PRODUCT ADVERTISEMENTS </w:t>
-      </w:r>
-    </w:p>
-    <w:p>
-      <w:pPr>
-        <w:spacing w:before="0" w:after="0" w:line="480" w:lineRule="auto"/>
+          <w:szCs w:val="24"/>
+        </w:rPr>
+      </w:r>
+    </w:p>
+    <w:p>
+      <w:pPr>
+        <w:spacing w:before="0" w:after="0" w:line="276" w:lineRule="auto"/>
+        <w:jc w:val="center"/>
         <w:ind w:firstLine="0"/>
+      </w:pPr>
+      <w:r>
+        <w:rPr>
+          <w:rFonts w:ascii="Georgia" w:hAnsi="Georgia" w:cs="Georgia"/>
+          <w:sz w:val="24"/>
+          <w:szCs w:val="24"/>
+        </w:rPr>
+      </w:r>
+    </w:p>
+    <w:p>
+      <w:pPr>
+        <w:spacing w:before="0" w:after="0" w:line="276" w:lineRule="auto"/>
         <w:jc w:val="center"/>
-      </w:pPr>
-      <w:r>
-        <w:rPr>
-          <w:rFonts w:ascii="Georgia" w:hAnsi="Georgia"/>
+        <w:ind w:firstLine="0"/>
+      </w:pPr>
+      <w:r>
+        <w:rPr>
+          <w:rFonts w:ascii="Georgia" w:hAnsi="Georgia" w:cs="Georgia"/>
+          <w:sz w:val="28"/>
+          <w:szCs w:val="28"/>
+          <w:b/>
+          <w:bCs/>
+        </w:rPr>
+        <w:t xml:space="preserve">PERSUASIVE LANGUAGE IN CALL-TO-ACTION PHRASES OF FACEBOOK SKINCARE PRODUCT ADVERTISEMENTS</w:t>
+      </w:r>
+    </w:p>
+    <w:p>
+      <w:pPr>
+        <w:spacing w:before="0" w:after="0" w:line="276" w:lineRule="auto"/>
+        <w:jc w:val="center"/>
+        <w:ind w:firstLine="0"/>
+      </w:pPr>
+      <w:r>
+        <w:rPr>
+          <w:rFonts w:ascii="Georgia" w:hAnsi="Georgia" w:cs="Georgia"/>
           <w:sz w:val="24"/>
-        </w:rPr>
-      </w:r>
-    </w:p>
-    <w:p>
-      <w:pPr>
-        <w:spacing w:before="0" w:after="0" w:line="480" w:lineRule="auto"/>
-        <w:ind w:firstLine="720"/>
-        <w:jc w:val="both"/>
-      </w:pPr>
-      <w:r>
-        <w:rPr>
-          <w:rFonts w:ascii="Georgia" w:hAnsi="Georgia"/>
-          <w:b w:val="0"/>
-          <w:sz w:val="22"/>
-        </w:rPr>
-        <w:t xml:space="preserve">A Thesis </w:t>
-      </w:r>
-    </w:p>
-    <w:p>
-      <w:pPr>
-        <w:spacing w:before="0" w:after="0" w:line="480" w:lineRule="auto"/>
-        <w:ind w:firstLine="720"/>
-        <w:jc w:val="both"/>
-      </w:pPr>
-      <w:r>
-        <w:rPr>
-          <w:rFonts w:ascii="Georgia" w:hAnsi="Georgia"/>
-          <w:b w:val="0"/>
-          <w:sz w:val="22"/>
-        </w:rPr>
-        <w:t xml:space="preserve"> Presented to the faculty</w:t>
-      </w:r>
-    </w:p>
-    <w:p>
-      <w:pPr>
-        <w:spacing w:before="0" w:after="0" w:line="480" w:lineRule="auto"/>
-        <w:ind w:firstLine="720"/>
-        <w:jc w:val="both"/>
-      </w:pPr>
-      <w:r>
-        <w:rPr>
-          <w:rFonts w:ascii="Georgia" w:hAnsi="Georgia"/>
-          <w:b w:val="0"/>
-          <w:sz w:val="22"/>
+          <w:szCs w:val="24"/>
+        </w:rPr>
+      </w:r>
+    </w:p>
+    <w:p>
+      <w:pPr>
+        <w:spacing w:before="0" w:after="0" w:line="276" w:lineRule="auto"/>
+        <w:jc w:val="center"/>
+        <w:ind w:firstLine="0"/>
+      </w:pPr>
+      <w:r>
+        <w:rPr>
+          <w:rFonts w:ascii="Georgia" w:hAnsi="Georgia" w:cs="Georgia"/>
+          <w:sz w:val="24"/>
+          <w:szCs w:val="24"/>
+        </w:rPr>
+      </w:r>
+    </w:p>
+    <w:p>
+      <w:pPr>
+        <w:spacing w:before="0" w:after="0" w:line="276" w:lineRule="auto"/>
+        <w:jc w:val="center"/>
+        <w:ind w:firstLine="0"/>
+      </w:pPr>
+      <w:r>
+        <w:rPr>
+          <w:rFonts w:ascii="Georgia" w:hAnsi="Georgia" w:cs="Georgia"/>
+          <w:sz w:val="24"/>
+          <w:szCs w:val="24"/>
+        </w:rPr>
+      </w:r>
+    </w:p>
+    <w:p>
+      <w:pPr>
+        <w:spacing w:before="0" w:after="0" w:line="276" w:lineRule="auto"/>
+        <w:jc w:val="center"/>
+        <w:ind w:firstLine="0"/>
+      </w:pPr>
+      <w:r>
+        <w:rPr>
+          <w:rFonts w:ascii="Georgia" w:hAnsi="Georgia" w:cs="Georgia"/>
+          <w:sz w:val="24"/>
+          <w:szCs w:val="24"/>
+        </w:rPr>
+        <w:t xml:space="preserve">A Thesis</w:t>
+      </w:r>
+    </w:p>
+    <w:p>
+      <w:pPr>
+        <w:spacing w:before="0" w:after="0" w:line="276" w:lineRule="auto"/>
+        <w:jc w:val="center"/>
+        <w:ind w:firstLine="0"/>
+      </w:pPr>
+      <w:r>
+        <w:rPr>
+          <w:rFonts w:ascii="Georgia" w:hAnsi="Georgia" w:cs="Georgia"/>
+          <w:sz w:val="24"/>
+          <w:szCs w:val="24"/>
+        </w:rPr>
+        <w:t xml:space="preserve">Presented to the faculty</w:t>
+      </w:r>
+    </w:p>
+    <w:p>
+      <w:pPr>
+        <w:spacing w:before="0" w:after="0" w:line="276" w:lineRule="auto"/>
+        <w:jc w:val="center"/>
+        <w:ind w:firstLine="0"/>
+      </w:pPr>
+      <w:r>
+        <w:rPr>
+          <w:rFonts w:ascii="Georgia" w:hAnsi="Georgia" w:cs="Georgia"/>
+          <w:sz w:val="24"/>
+          <w:szCs w:val="24"/>
         </w:rPr>
         <w:t xml:space="preserve">of the Department of English</w:t>
       </w:r>
     </w:p>
     <w:p>
       <w:pPr>
-        <w:spacing w:before="0" w:after="0" w:line="480" w:lineRule="auto"/>
-        <w:ind w:firstLine="720"/>
-        <w:jc w:val="both"/>
-      </w:pPr>
-      <w:r>
-        <w:rPr>
-          <w:rFonts w:ascii="Georgia" w:hAnsi="Georgia"/>
-          <w:b w:val="0"/>
-          <w:sz w:val="22"/>
+        <w:spacing w:before="0" w:after="0" w:line="276" w:lineRule="auto"/>
+        <w:jc w:val="center"/>
+        <w:ind w:firstLine="0"/>
+      </w:pPr>
+      <w:r>
+        <w:rPr>
+          <w:rFonts w:ascii="Georgia" w:hAnsi="Georgia" w:cs="Georgia"/>
+          <w:sz w:val="24"/>
+          <w:szCs w:val="24"/>
         </w:rPr>
         <w:t xml:space="preserve">College of Arts and Sciences</w:t>
       </w:r>
     </w:p>
     <w:p>
       <w:pPr>
-        <w:spacing w:before="0" w:after="0" w:line="480" w:lineRule="auto"/>
-        <w:ind w:firstLine="720"/>
-        <w:jc w:val="both"/>
-      </w:pPr>
-      <w:r>
-        <w:rPr>
-          <w:rFonts w:ascii="Georgia" w:hAnsi="Georgia"/>
-          <w:b w:val="0"/>
-          <w:sz w:val="22"/>
+        <w:spacing w:before="0" w:after="0" w:line="276" w:lineRule="auto"/>
+        <w:jc w:val="center"/>
+        <w:ind w:firstLine="0"/>
+      </w:pPr>
+      <w:r>
+        <w:rPr>
+          <w:rFonts w:ascii="Georgia" w:hAnsi="Georgia" w:cs="Georgia"/>
+          <w:sz w:val="24"/>
+          <w:szCs w:val="24"/>
         </w:rPr>
         <w:t xml:space="preserve">Pampanga State Agricultural University</w:t>
       </w:r>
     </w:p>
     <w:p>
       <w:pPr>
-        <w:spacing w:before="0" w:after="0" w:line="480" w:lineRule="auto"/>
-        <w:ind w:firstLine="720"/>
-        <w:jc w:val="both"/>
-      </w:pPr>
-      <w:r>
-        <w:rPr>
-          <w:rFonts w:ascii="Georgia" w:hAnsi="Georgia"/>
-          <w:b w:val="0"/>
-          <w:sz w:val="22"/>
+        <w:spacing w:before="0" w:after="0" w:line="276" w:lineRule="auto"/>
+        <w:jc w:val="center"/>
+        <w:ind w:firstLine="0"/>
+      </w:pPr>
+      <w:r>
+        <w:rPr>
+          <w:rFonts w:ascii="Georgia" w:hAnsi="Georgia" w:cs="Georgia"/>
+          <w:sz w:val="24"/>
+          <w:szCs w:val="24"/>
         </w:rPr>
         <w:t xml:space="preserve">Magalang, Pampanga</w:t>
       </w:r>
     </w:p>
     <w:p>
       <w:pPr>
-        <w:spacing w:before="0" w:after="0" w:line="480" w:lineRule="auto"/>
+        <w:spacing w:before="0" w:after="0" w:line="276" w:lineRule="auto"/>
+        <w:jc w:val="center"/>
         <w:ind w:firstLine="0"/>
+      </w:pPr>
+      <w:r>
+        <w:rPr>
+          <w:rFonts w:ascii="Georgia" w:hAnsi="Georgia" w:cs="Georgia"/>
+          <w:sz w:val="24"/>
+          <w:szCs w:val="24"/>
+        </w:rPr>
+      </w:r>
+    </w:p>
+    <w:p>
+      <w:pPr>
+        <w:spacing w:before="0" w:after="0" w:line="276" w:lineRule="auto"/>
         <w:jc w:val="center"/>
-      </w:pPr>
-      <w:r>
-        <w:rPr>
-          <w:rFonts w:ascii="Georgia" w:hAnsi="Georgia"/>
+        <w:ind w:firstLine="0"/>
+      </w:pPr>
+      <w:r>
+        <w:rPr>
+          <w:rFonts w:ascii="Georgia" w:hAnsi="Georgia" w:cs="Georgia"/>
           <w:sz w:val="24"/>
-        </w:rPr>
-      </w:r>
-    </w:p>
-    <w:p>
-      <w:pPr>
-        <w:spacing w:before="0" w:after="0" w:line="480" w:lineRule="auto"/>
-        <w:ind w:firstLine="720"/>
-        <w:jc w:val="both"/>
-      </w:pPr>
-      <w:r>
-        <w:rPr>
-          <w:rFonts w:ascii="Georgia" w:hAnsi="Georgia"/>
-          <w:b w:val="0"/>
-          <w:sz w:val="22"/>
+          <w:szCs w:val="24"/>
+        </w:rPr>
+      </w:r>
+    </w:p>
+    <w:p>
+      <w:pPr>
+        <w:spacing w:before="0" w:after="0" w:line="276" w:lineRule="auto"/>
+        <w:jc w:val="center"/>
+        <w:ind w:firstLine="0"/>
+      </w:pPr>
+      <w:r>
+        <w:rPr>
+          <w:rFonts w:ascii="Georgia" w:hAnsi="Georgia" w:cs="Georgia"/>
+          <w:sz w:val="24"/>
+          <w:szCs w:val="24"/>
+        </w:rPr>
+      </w:r>
+    </w:p>
+    <w:p>
+      <w:pPr>
+        <w:spacing w:before="0" w:after="0" w:line="276" w:lineRule="auto"/>
+        <w:jc w:val="center"/>
+        <w:ind w:firstLine="0"/>
+      </w:pPr>
+      <w:r>
+        <w:rPr>
+          <w:rFonts w:ascii="Georgia" w:hAnsi="Georgia" w:cs="Georgia"/>
+          <w:sz w:val="24"/>
+          <w:szCs w:val="24"/>
         </w:rPr>
         <w:t xml:space="preserve">In partial fulfillment</w:t>
       </w:r>
     </w:p>
     <w:p>
       <w:pPr>
-        <w:spacing w:before="0" w:after="0" w:line="480" w:lineRule="auto"/>
-        <w:ind w:firstLine="720"/>
-        <w:jc w:val="both"/>
-      </w:pPr>
-      <w:r>
-        <w:rPr>
-          <w:rFonts w:ascii="Georgia" w:hAnsi="Georgia"/>
-          <w:b w:val="0"/>
-          <w:sz w:val="22"/>
-        </w:rPr>
-        <w:t xml:space="preserve"> Of the Requirement for the Degree</w:t>
-      </w:r>
-    </w:p>
-    <w:p>
-      <w:pPr>
-        <w:spacing w:before="0" w:after="0" w:line="480" w:lineRule="auto"/>
-        <w:ind w:firstLine="720"/>
-        <w:jc w:val="both"/>
-      </w:pPr>
-      <w:r>
-        <w:rPr>
-          <w:rFonts w:ascii="Georgia" w:hAnsi="Georgia"/>
-          <w:b w:val="0"/>
-          <w:sz w:val="22"/>
+        <w:spacing w:before="0" w:after="0" w:line="276" w:lineRule="auto"/>
+        <w:jc w:val="center"/>
+        <w:ind w:firstLine="0"/>
+      </w:pPr>
+      <w:r>
+        <w:rPr>
+          <w:rFonts w:ascii="Georgia" w:hAnsi="Georgia" w:cs="Georgia"/>
+          <w:sz w:val="24"/>
+          <w:szCs w:val="24"/>
+        </w:rPr>
+        <w:t xml:space="preserve">Of the Requirement for the Degree</w:t>
+      </w:r>
+    </w:p>
+    <w:p>
+      <w:pPr>
+        <w:spacing w:before="0" w:after="0" w:line="276" w:lineRule="auto"/>
+        <w:jc w:val="center"/>
+        <w:ind w:firstLine="0"/>
+      </w:pPr>
+      <w:r>
+        <w:rPr>
+          <w:rFonts w:ascii="Georgia" w:hAnsi="Georgia" w:cs="Georgia"/>
+          <w:sz w:val="24"/>
+          <w:szCs w:val="24"/>
         </w:rPr>
         <w:t xml:space="preserve">BACHELOR OF ARTS IN ENGLISH LANGUAGE STUDIES</w:t>
       </w:r>
     </w:p>
     <w:p>
       <w:pPr>
-        <w:spacing w:before="0" w:after="0" w:line="480" w:lineRule="auto"/>
+        <w:spacing w:before="0" w:after="0" w:line="276" w:lineRule="auto"/>
+        <w:jc w:val="center"/>
         <w:ind w:firstLine="0"/>
+      </w:pPr>
+      <w:r>
+        <w:rPr>
+          <w:rFonts w:ascii="Georgia" w:hAnsi="Georgia" w:cs="Georgia"/>
+          <w:sz w:val="24"/>
+          <w:szCs w:val="24"/>
+        </w:rPr>
+      </w:r>
+    </w:p>
+    <w:p>
+      <w:pPr>
+        <w:spacing w:before="0" w:after="0" w:line="276" w:lineRule="auto"/>
         <w:jc w:val="center"/>
-      </w:pPr>
-      <w:r>
-        <w:rPr>
-          <w:rFonts w:ascii="Georgia" w:hAnsi="Georgia"/>
+        <w:ind w:firstLine="0"/>
+      </w:pPr>
+      <w:r>
+        <w:rPr>
+          <w:rFonts w:ascii="Georgia" w:hAnsi="Georgia" w:cs="Georgia"/>
           <w:sz w:val="24"/>
-        </w:rPr>
-      </w:r>
-    </w:p>
-    <w:p>
-      <w:pPr>
-        <w:spacing w:before="0" w:after="0" w:line="480" w:lineRule="auto"/>
-        <w:ind w:firstLine="720"/>
-        <w:jc w:val="both"/>
-      </w:pPr>
-      <w:r>
-        <w:rPr>
-          <w:rFonts w:ascii="Georgia" w:hAnsi="Georgia"/>
-          <w:b w:val="0"/>
-          <w:sz w:val="22"/>
-        </w:rPr>
-        <w:t xml:space="preserve"> By</w:t>
-      </w:r>
-    </w:p>
-    <w:p>
-      <w:pPr>
-        <w:spacing w:before="0" w:after="0" w:line="480" w:lineRule="auto"/>
-        <w:ind w:firstLine="720"/>
-        <w:jc w:val="both"/>
-      </w:pPr>
-      <w:r>
-        <w:rPr>
-          <w:rFonts w:ascii="Georgia" w:hAnsi="Georgia"/>
-          <w:b w:val="0"/>
-          <w:sz w:val="22"/>
+          <w:szCs w:val="24"/>
+        </w:rPr>
+      </w:r>
+    </w:p>
+    <w:p>
+      <w:pPr>
+        <w:spacing w:before="0" w:after="0" w:line="276" w:lineRule="auto"/>
+        <w:jc w:val="center"/>
+        <w:ind w:firstLine="0"/>
+      </w:pPr>
+      <w:r>
+        <w:rPr>
+          <w:rFonts w:ascii="Georgia" w:hAnsi="Georgia" w:cs="Georgia"/>
+          <w:sz w:val="24"/>
+          <w:szCs w:val="24"/>
+        </w:rPr>
+      </w:r>
+    </w:p>
+    <w:p>
+      <w:pPr>
+        <w:spacing w:before="0" w:after="0" w:line="276" w:lineRule="auto"/>
+        <w:jc w:val="center"/>
+        <w:ind w:firstLine="0"/>
+      </w:pPr>
+      <w:r>
+        <w:rPr>
+          <w:rFonts w:ascii="Georgia" w:hAnsi="Georgia" w:cs="Georgia"/>
+          <w:sz w:val="24"/>
+          <w:szCs w:val="24"/>
+        </w:rPr>
+        <w:t xml:space="preserve">by</w:t>
+      </w:r>
+    </w:p>
+    <w:p>
+      <w:pPr>
+        <w:spacing w:before="0" w:after="0" w:line="276" w:lineRule="auto"/>
+        <w:jc w:val="center"/>
+        <w:ind w:firstLine="0"/>
+      </w:pPr>
+      <w:r>
+        <w:rPr>
+          <w:rFonts w:ascii="Georgia" w:hAnsi="Georgia" w:cs="Georgia"/>
+          <w:sz w:val="24"/>
+          <w:szCs w:val="24"/>
+        </w:rPr>
+      </w:r>
+    </w:p>
+    <w:p>
+      <w:pPr>
+        <w:spacing w:before="0" w:after="0" w:line="276" w:lineRule="auto"/>
+        <w:jc w:val="center"/>
+        <w:ind w:firstLine="0"/>
+      </w:pPr>
+      <w:r>
+        <w:rPr>
+          <w:rFonts w:ascii="Georgia" w:hAnsi="Georgia" w:cs="Georgia"/>
+          <w:sz w:val="24"/>
+          <w:szCs w:val="24"/>
+        </w:rPr>
+      </w:r>
+    </w:p>
+    <w:p>
+      <w:pPr>
+        <w:spacing w:before="0" w:after="0" w:line="276" w:lineRule="auto"/>
+        <w:jc w:val="center"/>
+        <w:ind w:firstLine="0"/>
+      </w:pPr>
+      <w:r>
+        <w:rPr>
+          <w:rFonts w:ascii="Georgia" w:hAnsi="Georgia" w:cs="Georgia"/>
+          <w:sz w:val="24"/>
+          <w:szCs w:val="24"/>
+        </w:rPr>
+      </w:r>
+    </w:p>
+    <w:p>
+      <w:pPr>
+        <w:spacing w:before="0" w:after="0" w:line="276" w:lineRule="auto"/>
+        <w:jc w:val="center"/>
+        <w:ind w:firstLine="0"/>
+      </w:pPr>
+      <w:r>
+        <w:rPr>
+          <w:rFonts w:ascii="Georgia" w:hAnsi="Georgia" w:cs="Georgia"/>
+          <w:sz w:val="24"/>
+          <w:szCs w:val="24"/>
+        </w:rPr>
+      </w:r>
+    </w:p>
+    <w:p>
+      <w:pPr>
+        <w:spacing w:before="0" w:after="0" w:line="276" w:lineRule="auto"/>
+        <w:jc w:val="center"/>
+        <w:ind w:firstLine="0"/>
+      </w:pPr>
+      <w:r>
+        <w:rPr>
+          <w:rFonts w:ascii="Georgia" w:hAnsi="Georgia" w:cs="Georgia"/>
+          <w:sz w:val="24"/>
+          <w:szCs w:val="24"/>
+        </w:rPr>
+      </w:r>
+    </w:p>
+    <w:p>
+      <w:pPr>
+        <w:spacing w:before="0" w:after="0" w:line="276" w:lineRule="auto"/>
+        <w:jc w:val="center"/>
+        <w:ind w:firstLine="0"/>
+      </w:pPr>
+      <w:r>
+        <w:rPr>
+          <w:rFonts w:ascii="Georgia" w:hAnsi="Georgia" w:cs="Georgia"/>
+          <w:sz w:val="24"/>
+          <w:szCs w:val="24"/>
+        </w:rPr>
+      </w:r>
+    </w:p>
+    <w:p>
+      <w:pPr>
+        <w:spacing w:before="0" w:after="0" w:line="276" w:lineRule="auto"/>
+        <w:jc w:val="center"/>
+        <w:ind w:firstLine="0"/>
+      </w:pPr>
+      <w:r>
+        <w:rPr>
+          <w:rFonts w:ascii="Georgia" w:hAnsi="Georgia" w:cs="Georgia"/>
+          <w:sz w:val="24"/>
+          <w:szCs w:val="24"/>
         </w:rPr>
         <w:t xml:space="preserve">AHLAI JEHZIEL M. VELASQUEZ</w:t>
       </w:r>
     </w:p>
     <w:p>
       <w:pPr>
-        <w:spacing w:before="0" w:after="0" w:line="480" w:lineRule="auto"/>
-        <w:ind w:firstLine="720"/>
-        <w:jc w:val="both"/>
-      </w:pPr>
-      <w:r>
-        <w:rPr>
-          <w:rFonts w:ascii="Georgia" w:hAnsi="Georgia"/>
-          <w:b w:val="0"/>
-          <w:sz w:val="22"/>
+        <w:spacing w:before="0" w:after="0" w:line="276" w:lineRule="auto"/>
+        <w:jc w:val="center"/>
+        <w:ind w:firstLine="0"/>
+      </w:pPr>
+      <w:r>
+        <w:rPr>
+          <w:rFonts w:ascii="Georgia" w:hAnsi="Georgia" w:cs="Georgia"/>
+          <w:sz w:val="24"/>
+          <w:szCs w:val="24"/>
         </w:rPr>
         <w:t xml:space="preserve">October, 2026</w:t>
       </w:r>
@@ -252,11 +454,9 @@
     <w:p>
       <w:pPr>
         <w:spacing w:before="0" w:after="0" w:line="480" w:lineRule="auto"/>
+        <w:jc w:val="center"/>
         <w:ind w:firstLine="0"/>
-        <w:jc w:val="left"/>
         <w:sectPr>
-          <w:headerReference w:type="default" r:id="rId64"/>
-          <w:headerReference w:type="first" r:id="rId65"/>
           <w:type w:val="nextPage"/>
           <w:pgSz w:w="11909" w:h="16834"/>
           <w:pgMar w:top="1440" w:right="1440" w:bottom="1440" w:left="2160" w:header="720" w:footer="720" w:gutter="0"/>
@@ -265,47 +465,9 @@
       </w:pPr>
       <w:r>
         <w:rPr>
-          <w:rFonts w:ascii="Georgia" w:hAnsi="Georgia"/>
-          <w:sz w:val="22"/>
-        </w:rPr>
-      </w:r>
-    </w:p>
-    <w:p>
-      <w:pPr>
-        <w:spacing w:before="0" w:after="0" w:line="480" w:lineRule="auto"/>
-        <w:ind w:firstLine="0"/>
-        <w:jc w:val="left"/>
-      </w:pPr>
-      <w:r>
-        <w:rPr>
-          <w:rFonts w:ascii="Georgia" w:hAnsi="Georgia"/>
-          <w:sz w:val="22"/>
-        </w:rPr>
-      </w:r>
-    </w:p>
-    <w:p>
-      <w:pPr>
-        <w:spacing w:before="0" w:after="0" w:line="480" w:lineRule="auto"/>
-        <w:ind w:firstLine="0"/>
-        <w:jc w:val="left"/>
-      </w:pPr>
-      <w:r>
-        <w:rPr>
-          <w:rFonts w:ascii="Georgia" w:hAnsi="Georgia"/>
-          <w:sz w:val="22"/>
-        </w:rPr>
-      </w:r>
-    </w:p>
-    <w:p>
-      <w:pPr>
-        <w:spacing w:before="0" w:after="0" w:line="480" w:lineRule="auto"/>
-        <w:ind w:firstLine="0"/>
-        <w:jc w:val="left"/>
-      </w:pPr>
-      <w:r>
-        <w:rPr>
-          <w:rFonts w:ascii="Georgia" w:hAnsi="Georgia"/>
-          <w:sz w:val="22"/>
+          <w:rFonts w:ascii="Georgia" w:hAnsi="Georgia" w:cs="Georgia"/>
+          <w:sz w:val="22"/>
+          <w:szCs w:val="22"/>
         </w:rPr>
       </w:r>
     </w:p>

</xml_diff>